<commit_message>
docs: rigenera PDF e Word con le correzioni di front-end
Co-Authored-By: Claude Sonnet 5.5 <noreply@anthropic.com>
Claude-Session: https://claude.ai/code/session_01DPUBhn6Kdf7URgPzZNjJaf
</commit_message>
<xml_diff>
--- a/deliverables/BiblioFlow-CR-BF-01-consegna-2026-10-13/documenti/02 - Specifica dei casi di test pre-modifica.docx
+++ b/deliverables/BiblioFlow-CR-BF-01-consegna-2026-10-13/documenti/02 - Specifica dei casi di test pre-modifica.docx
@@ -86,7 +86,7 @@
         <w:rPr>
           <w:rStyle w:val="VerbatimChar"/>
         </w:rPr>
-        <w:t>20efb4b</w:t>
+        <w:t>1730b23</w:t>
       </w:r>
     </w:p>
     <w:p>
@@ -156,7 +156,7 @@
             </w:rPr>
             <w:fldChar w:fldCharType="separate"/>
           </w:r>
-          <w:hyperlink w:anchor="__RefHeading___Toc10046_4122350189">
+          <w:hyperlink w:anchor="__RefHeading___Toc10081_2049021629">
             <w:r>
               <w:rPr>
                 <w:webHidden/>
@@ -177,7 +177,7 @@
             </w:tabs>
             <w:rPr/>
           </w:pPr>
-          <w:hyperlink w:anchor="__RefHeading___Toc10048_4122350189">
+          <w:hyperlink w:anchor="__RefHeading___Toc10083_2049021629">
             <w:r>
               <w:rPr>
                 <w:webHidden/>
@@ -198,7 +198,7 @@
             </w:tabs>
             <w:rPr/>
           </w:pPr>
-          <w:hyperlink w:anchor="__RefHeading___Toc10050_4122350189">
+          <w:hyperlink w:anchor="__RefHeading___Toc10085_2049021629">
             <w:r>
               <w:rPr>
                 <w:webHidden/>
@@ -219,7 +219,7 @@
             </w:tabs>
             <w:rPr/>
           </w:pPr>
-          <w:hyperlink w:anchor="__RefHeading___Toc10052_4122350189">
+          <w:hyperlink w:anchor="__RefHeading___Toc10087_2049021629">
             <w:r>
               <w:rPr>
                 <w:webHidden/>
@@ -240,7 +240,7 @@
             </w:tabs>
             <w:rPr/>
           </w:pPr>
-          <w:hyperlink w:anchor="__RefHeading___Toc10054_4122350189">
+          <w:hyperlink w:anchor="__RefHeading___Toc10089_2049021629">
             <w:r>
               <w:rPr>
                 <w:webHidden/>
@@ -261,7 +261,7 @@
             </w:tabs>
             <w:rPr/>
           </w:pPr>
-          <w:hyperlink w:anchor="__RefHeading___Toc10056_4122350189">
+          <w:hyperlink w:anchor="__RefHeading___Toc10091_2049021629">
             <w:r>
               <w:rPr>
                 <w:webHidden/>
@@ -282,7 +282,7 @@
             </w:tabs>
             <w:rPr/>
           </w:pPr>
-          <w:hyperlink w:anchor="__RefHeading___Toc10058_4122350189">
+          <w:hyperlink w:anchor="__RefHeading___Toc10093_2049021629">
             <w:r>
               <w:rPr>
                 <w:webHidden/>
@@ -303,7 +303,7 @@
             </w:tabs>
             <w:rPr/>
           </w:pPr>
-          <w:hyperlink w:anchor="__RefHeading___Toc10060_4122350189">
+          <w:hyperlink w:anchor="__RefHeading___Toc10095_2049021629">
             <w:r>
               <w:rPr>
                 <w:webHidden/>
@@ -324,7 +324,7 @@
             </w:tabs>
             <w:rPr/>
           </w:pPr>
-          <w:hyperlink w:anchor="__RefHeading___Toc10062_4122350189">
+          <w:hyperlink w:anchor="__RefHeading___Toc10097_2049021629">
             <w:r>
               <w:rPr>
                 <w:webHidden/>
@@ -345,7 +345,7 @@
             </w:tabs>
             <w:rPr/>
           </w:pPr>
-          <w:hyperlink w:anchor="__RefHeading___Toc10064_4122350189">
+          <w:hyperlink w:anchor="__RefHeading___Toc10099_2049021629">
             <w:r>
               <w:rPr>
                 <w:webHidden/>
@@ -366,7 +366,7 @@
             </w:tabs>
             <w:rPr/>
           </w:pPr>
-          <w:hyperlink w:anchor="__RefHeading___Toc10066_4122350189">
+          <w:hyperlink w:anchor="__RefHeading___Toc10101_2049021629">
             <w:r>
               <w:rPr>
                 <w:webHidden/>
@@ -387,7 +387,7 @@
             </w:tabs>
             <w:rPr/>
           </w:pPr>
-          <w:hyperlink w:anchor="__RefHeading___Toc10068_4122350189">
+          <w:hyperlink w:anchor="__RefHeading___Toc10103_2049021629">
             <w:r>
               <w:rPr>
                 <w:webHidden/>
@@ -408,7 +408,7 @@
             </w:tabs>
             <w:rPr/>
           </w:pPr>
-          <w:hyperlink w:anchor="__RefHeading___Toc10070_4122350189">
+          <w:hyperlink w:anchor="__RefHeading___Toc10105_2049021629">
             <w:r>
               <w:rPr>
                 <w:webHidden/>
@@ -429,7 +429,7 @@
             </w:tabs>
             <w:rPr/>
           </w:pPr>
-          <w:hyperlink w:anchor="__RefHeading___Toc10072_4122350189">
+          <w:hyperlink w:anchor="__RefHeading___Toc10107_2049021629">
             <w:r>
               <w:rPr>
                 <w:webHidden/>
@@ -450,7 +450,7 @@
             </w:tabs>
             <w:rPr/>
           </w:pPr>
-          <w:hyperlink w:anchor="__RefHeading___Toc10074_4122350189">
+          <w:hyperlink w:anchor="__RefHeading___Toc10109_2049021629">
             <w:r>
               <w:rPr>
                 <w:webHidden/>
@@ -471,7 +471,7 @@
             </w:tabs>
             <w:rPr/>
           </w:pPr>
-          <w:hyperlink w:anchor="__RefHeading___Toc10076_4122350189">
+          <w:hyperlink w:anchor="__RefHeading___Toc10111_2049021629">
             <w:r>
               <w:rPr>
                 <w:webHidden/>
@@ -492,7 +492,7 @@
             </w:tabs>
             <w:rPr/>
           </w:pPr>
-          <w:hyperlink w:anchor="__RefHeading___Toc10078_4122350189">
+          <w:hyperlink w:anchor="__RefHeading___Toc10113_2049021629">
             <w:r>
               <w:rPr>
                 <w:webHidden/>
@@ -513,7 +513,7 @@
             </w:tabs>
             <w:rPr/>
           </w:pPr>
-          <w:hyperlink w:anchor="__RefHeading___Toc10080_4122350189">
+          <w:hyperlink w:anchor="__RefHeading___Toc10115_2049021629">
             <w:r>
               <w:rPr>
                 <w:webHidden/>
@@ -534,7 +534,7 @@
             </w:tabs>
             <w:rPr/>
           </w:pPr>
-          <w:hyperlink w:anchor="__RefHeading___Toc10082_4122350189">
+          <w:hyperlink w:anchor="__RefHeading___Toc10117_2049021629">
             <w:r>
               <w:rPr>
                 <w:webHidden/>
@@ -582,7 +582,7 @@
         <w:spacing w:before="0" w:after="120"/>
         <w:rPr/>
       </w:pPr>
-      <w:bookmarkStart w:id="0" w:name="__RefHeading___Toc10046_4122350189"/>
+      <w:bookmarkStart w:id="0" w:name="__RefHeading___Toc10081_2049021629"/>
       <w:bookmarkStart w:id="1" w:name="X322cd66ea67d914d6bfa2372f9425c17befdcb5"/>
       <w:bookmarkEnd w:id="0"/>
       <w:r>
@@ -595,7 +595,7 @@
         <w:pStyle w:val="Heading2"/>
         <w:rPr/>
       </w:pPr>
-      <w:bookmarkStart w:id="2" w:name="__RefHeading___Toc10048_4122350189"/>
+      <w:bookmarkStart w:id="2" w:name="__RefHeading___Toc10083_2049021629"/>
       <w:bookmarkStart w:id="3" w:name="scopo"/>
       <w:bookmarkEnd w:id="2"/>
       <w:r>
@@ -630,7 +630,7 @@
         <w:pStyle w:val="Heading2"/>
         <w:rPr/>
       </w:pPr>
-      <w:bookmarkStart w:id="5" w:name="__RefHeading___Toc10050_4122350189"/>
+      <w:bookmarkStart w:id="5" w:name="__RefHeading___Toc10085_2049021629"/>
       <w:bookmarkStart w:id="6" w:name="convenzione-degli-identificativi"/>
       <w:bookmarkEnd w:id="5"/>
       <w:r>
@@ -725,7 +725,7 @@
         <w:pStyle w:val="Heading2"/>
         <w:rPr/>
       </w:pPr>
-      <w:bookmarkStart w:id="8" w:name="__RefHeading___Toc10052_4122350189"/>
+      <w:bookmarkStart w:id="8" w:name="__RefHeading___Toc10087_2049021629"/>
       <w:bookmarkStart w:id="9" w:name="ambiente-e-dati"/>
       <w:bookmarkEnd w:id="8"/>
       <w:r>
@@ -844,7 +844,7 @@
         <w:pStyle w:val="Heading2"/>
         <w:rPr/>
       </w:pPr>
-      <w:bookmarkStart w:id="11" w:name="__RefHeading___Toc10054_4122350189"/>
+      <w:bookmarkStart w:id="11" w:name="__RefHeading___Toc10089_2049021629"/>
       <w:bookmarkEnd w:id="11"/>
       <w:r>
         <w:rPr/>
@@ -3637,7 +3637,7 @@
         <w:pStyle w:val="Heading2"/>
         <w:rPr/>
       </w:pPr>
-      <w:bookmarkStart w:id="14" w:name="__RefHeading___Toc10056_4122350189"/>
+      <w:bookmarkStart w:id="14" w:name="__RefHeading___Toc10091_2049021629"/>
       <w:bookmarkEnd w:id="14"/>
       <w:r>
         <w:rPr/>
@@ -3886,7 +3886,7 @@
         <w:pStyle w:val="Heading2"/>
         <w:rPr/>
       </w:pPr>
-      <w:bookmarkStart w:id="15" w:name="__RefHeading___Toc10058_4122350189"/>
+      <w:bookmarkStart w:id="15" w:name="__RefHeading___Toc10093_2049021629"/>
       <w:bookmarkEnd w:id="15"/>
       <w:r>
         <w:rPr/>
@@ -4021,7 +4021,7 @@
         <w:pStyle w:val="Heading1"/>
         <w:rPr/>
       </w:pPr>
-      <w:bookmarkStart w:id="17" w:name="__RefHeading___Toc10060_4122350189"/>
+      <w:bookmarkStart w:id="17" w:name="__RefHeading___Toc10095_2049021629"/>
       <w:bookmarkStart w:id="18" w:name="X608fff5feebc4a9e33c84493d2ad94cb2cd424a"/>
       <w:bookmarkEnd w:id="17"/>
       <w:r>
@@ -4034,7 +4034,7 @@
         <w:pStyle w:val="Heading2"/>
         <w:rPr/>
       </w:pPr>
-      <w:bookmarkStart w:id="19" w:name="__RefHeading___Toc10062_4122350189"/>
+      <w:bookmarkStart w:id="19" w:name="__RefHeading___Toc10097_2049021629"/>
       <w:bookmarkStart w:id="20" w:name="scopo-e-baseline"/>
       <w:bookmarkEnd w:id="19"/>
       <w:r>
@@ -4185,7 +4185,7 @@
         <w:pStyle w:val="Heading2"/>
         <w:rPr/>
       </w:pPr>
-      <w:bookmarkStart w:id="22" w:name="__RefHeading___Toc10064_4122350189"/>
+      <w:bookmarkStart w:id="22" w:name="__RefHeading___Toc10099_2049021629"/>
       <w:bookmarkStart w:id="23" w:name="dati-e-convenzioni-comuni"/>
       <w:bookmarkEnd w:id="22"/>
       <w:r>
@@ -4383,7 +4383,7 @@
         <w:pStyle w:val="Heading2"/>
         <w:rPr/>
       </w:pPr>
-      <w:bookmarkStart w:id="24" w:name="__RefHeading___Toc10066_4122350189"/>
+      <w:bookmarkStart w:id="24" w:name="__RefHeading___Toc10101_2049021629"/>
       <w:bookmarkEnd w:id="24"/>
       <w:r>
         <w:rPr/>
@@ -5918,7 +5918,7 @@
         <w:pStyle w:val="Heading2"/>
         <w:rPr/>
       </w:pPr>
-      <w:bookmarkStart w:id="26" w:name="__RefHeading___Toc10068_4122350189"/>
+      <w:bookmarkStart w:id="26" w:name="__RefHeading___Toc10103_2049021629"/>
       <w:bookmarkEnd w:id="26"/>
       <w:r>
         <w:rPr/>
@@ -7114,7 +7114,7 @@
         <w:pStyle w:val="Heading2"/>
         <w:rPr/>
       </w:pPr>
-      <w:bookmarkStart w:id="37" w:name="__RefHeading___Toc10070_4122350189"/>
+      <w:bookmarkStart w:id="37" w:name="__RefHeading___Toc10105_2049021629"/>
       <w:bookmarkStart w:id="38" w:name="osservazioni-per-le-fasi-successive"/>
       <w:bookmarkEnd w:id="37"/>
       <w:r>
@@ -7222,7 +7222,7 @@
         <w:pStyle w:val="Heading1"/>
         <w:rPr/>
       </w:pPr>
-      <w:bookmarkStart w:id="41" w:name="__RefHeading___Toc10072_4122350189"/>
+      <w:bookmarkStart w:id="41" w:name="__RefHeading___Toc10107_2049021629"/>
       <w:bookmarkStart w:id="42" w:name="X9296c5b70738d0f320ad56c1d3f68a3f01f3580"/>
       <w:bookmarkEnd w:id="41"/>
       <w:r>
@@ -7235,7 +7235,7 @@
         <w:pStyle w:val="Heading2"/>
         <w:rPr/>
       </w:pPr>
-      <w:bookmarkStart w:id="43" w:name="__RefHeading___Toc10074_4122350189"/>
+      <w:bookmarkStart w:id="43" w:name="__RefHeading___Toc10109_2049021629"/>
       <w:bookmarkStart w:id="44" w:name="scopo-e-tracciabilità"/>
       <w:bookmarkEnd w:id="43"/>
       <w:r>
@@ -7462,7 +7462,7 @@
         <w:pStyle w:val="Heading2"/>
         <w:rPr/>
       </w:pPr>
-      <w:bookmarkStart w:id="45" w:name="__RefHeading___Toc10076_4122350189"/>
+      <w:bookmarkStart w:id="45" w:name="__RefHeading___Toc10111_2049021629"/>
       <w:bookmarkEnd w:id="45"/>
       <w:r>
         <w:rPr/>
@@ -8712,7 +8712,7 @@
         <w:pStyle w:val="Heading2"/>
         <w:rPr/>
       </w:pPr>
-      <w:bookmarkStart w:id="47" w:name="__RefHeading___Toc10078_4122350189"/>
+      <w:bookmarkStart w:id="47" w:name="__RefHeading___Toc10113_2049021629"/>
       <w:bookmarkEnd w:id="47"/>
       <w:r>
         <w:rPr/>
@@ -10785,7 +10785,7 @@
         <w:pStyle w:val="Heading2"/>
         <w:rPr/>
       </w:pPr>
-      <w:bookmarkStart w:id="48" w:name="__RefHeading___Toc10080_4122350189"/>
+      <w:bookmarkStart w:id="48" w:name="__RefHeading___Toc10115_2049021629"/>
       <w:bookmarkEnd w:id="48"/>
       <w:r>
         <w:rPr/>
@@ -11969,7 +11969,7 @@
         <w:pStyle w:val="Heading2"/>
         <w:rPr/>
       </w:pPr>
-      <w:bookmarkStart w:id="63" w:name="__RefHeading___Toc10082_4122350189"/>
+      <w:bookmarkStart w:id="63" w:name="__RefHeading___Toc10117_2049021629"/>
       <w:bookmarkStart w:id="64" w:name="note-per-i-test-post-modifica"/>
       <w:bookmarkEnd w:id="63"/>
       <w:r>

</xml_diff>